<commit_message>
Complete dashboard analytics and release version 2.1.0
</commit_message>
<xml_diff>
--- a/docs/Fantasy_Football_Intelligence_Hub_Software_Design_Specification.docx
+++ b/docs/Fantasy_Football_Intelligence_Hub_Software_Design_Specification.docx
@@ -111,14 +111,8 @@
             <w:vAlign w:val="top"/>
           </w:tcPr>
           <w:p>
-            <w:pPr>
-              <w:spacing w:after="0"/>
-            </w:pPr>
-            <w:r>
-              <w:rPr>
-                <w:sz w:val="18"/>
-              </w:rPr>
-              <w:t>2.0</w:t>
+            <w:r>
+              <w:t>2.1</w:t>
             </w:r>
           </w:p>
         </w:tc>
@@ -147,14 +141,8 @@
             <w:vAlign w:val="top"/>
           </w:tcPr>
           <w:p>
-            <w:pPr>
-              <w:spacing w:after="0"/>
-            </w:pPr>
-            <w:r>
-              <w:rPr>
-                <w:sz w:val="18"/>
-              </w:rPr>
-              <w:t>Fantasy Football Intelligence Hub v2.0 / APP_VERSION 2.0.0</w:t>
+            <w:r>
+              <w:t>Fantasy Football Intelligence Hub v2.1 / APP_VERSION 2.1.0</w:t>
             </w:r>
           </w:p>
         </w:tc>
@@ -183,14 +171,8 @@
             <w:vAlign w:val="top"/>
           </w:tcPr>
           <w:p>
-            <w:pPr>
-              <w:spacing w:after="0"/>
-            </w:pPr>
-            <w:r>
-              <w:rPr>
-                <w:sz w:val="18"/>
-              </w:rPr>
-              <w:t>Living design specification - documentation refresh within Version 2.0</w:t>
+            <w:r>
+              <w:t>Living design specification - Version 2.1 feature release</w:t>
             </w:r>
           </w:p>
         </w:tc>
@@ -255,14 +237,8 @@
             <w:vAlign w:val="top"/>
           </w:tcPr>
           <w:p>
-            <w:pPr>
-              <w:spacing w:after="0"/>
-            </w:pPr>
-            <w:r>
-              <w:rPr>
-                <w:sz w:val="18"/>
-              </w:rPr>
-              <w:t>July 27, 2026</w:t>
+            <w:r>
+              <w:t>July 28, 2026</w:t>
             </w:r>
           </w:p>
         </w:tc>
@@ -394,13 +370,7 @@
           </w:tcPr>
           <w:p>
             <w:r>
-              <w:rPr>
-                <w:b/>
-              </w:rPr>
-              <w:t xml:space="preserve">Version-control decision: </w:t>
-            </w:r>
-            <w:r>
-              <w:t>This update documents the completed Version 2.0 architecture refactor, testing, snapshot automation, and GitHub Pages deployment. It does not increment the application version or publish a new product release.</w:t>
+              <w:t>Version-control decision: Version 2.1.0 is a minor feature release. It combines the simplified league-analysis landing experience, automatic setup detection, paced loading workflow, and dashboard current-season and historical performance summaries. The Version 2.0 architecture remains the underlying system baseline.</w:t>
             </w:r>
           </w:p>
         </w:tc>
@@ -443,6 +413,73 @@
     <w:p>
       <w:r>
         <w:t>5. Application Components and User Experience</w:t>
+      </w:r>
+    </w:p>
+    <w:p>
+      <w:pPr>
+        <w:pStyle w:val="Heading2"/>
+      </w:pPr>
+      <w:r>
+        <w:t>5.1 Version 2.1 League Analysis Experience</w:t>
+      </w:r>
+    </w:p>
+    <w:p>
+      <w:pPr/>
+      <w:r>
+        <w:t>The landing page uses one primary Analyze League button. Live refresh, previous-report access, and report deletion are secondary actions. League format, roster structure, scoring, linked-season history, and future-pick horizon are detected automatically, while advanced overrides remain available for edge cases. Contender Ranking Weights include visible scope and calculation guidance. The loading workflow displays staged progress for a randomized minimum of 7 to 10 seconds unless real processing requires longer; errors interrupt immediately.</w:t>
+      </w:r>
+    </w:p>
+    <w:p>
+      <w:pPr>
+        <w:pStyle w:val="Heading2"/>
+      </w:pPr>
+      <w:r>
+        <w:t>5.2 Version 2.1 Dashboard Summaries</w:t>
+      </w:r>
+    </w:p>
+    <w:p>
+      <w:pPr/>
+      <w:r>
+        <w:t>The Dashboard separates Current Season metrics from Overall Performance. Current Season includes Contender Rank, Expected PPG, gaps to the leader and league average, and actual Sleeper standing and record. Overall Performance includes average finish, historical average PPG with league rank and league-average comparison, cumulative record, and win percentage. The same release also removes the standalone projected-lineup chart, expands League Power Rankings to full width, adds QB, RB, WR, TE, and FLEX ranks, and replaces the prior evidence-list recommendation area with a championship recommendation and position-by-position review.</w:t>
+      </w:r>
+    </w:p>
+    <w:p>
+      <w:pPr>
+        <w:pStyle w:val="Heading2"/>
+      </w:pPr>
+      <w:r>
+        <w:t>5.3 Version 2.1 League Power Rankings and Championship Review</w:t>
+      </w:r>
+    </w:p>
+    <w:p>
+      <w:r>
+        <w:t>The League Power Rankings panel spans the full dashboard width. The separate Projected Lineup PPG chart is removed because EPPG remains available as a ranking column and analytical input. The expanded table preserves the original Class, EPPG, Depth, current or prior PF, Dynasty Value, Risk, Future 1sts, Contender Index, and Dynasty Rank fields. It also adds gap to the leader, QB rank, RB rank, WR rank, TE rank, FLEX rank, biggest positional strength, and biggest positional weakness.</w:t>
+      </w:r>
+    </w:p>
+    <w:p>
+      <w:r>
+        <w:t>Positional ranks are calculated by sorting team positionScores for QB, RB, WR, TE, and FLEX. FLEX represents players assigned to legal flex slots after required positional starters are filled. The strongest and weakest labels are derived from the best and worst positional ranks, with projected score used as a tie breaker.</w:t>
+      </w:r>
+    </w:p>
+    <w:p>
+      <w:r>
+        <w:t>On mobile viewports, the full table is replaced by expandable team cards that retain rank, class, EPPG, PF, Dynasty Value, Dynasty Rank, Contender Index, Depth, Risk, Future 1sts, gap to the leader, all five positional ranks, biggest strength, and biggest weakness.</w:t>
+      </w:r>
+    </w:p>
+    <w:p>
+      <w:r>
+        <w:t>The former recommendation panel is renamed Championship Outlook &amp; Roster Review. The top recommendation can advise a targeted upgrade, a value-conscious improvement, holding the roster, or avoiding win-now spending. The recommendation provides an expanded plain-language explanation of why that strategy fits the team, the trade-offs it is intended to manage, and the conditions that should change the recommendation. Structured support includes contender rank, gap to the leader, primary need, weakest rank, depth rank, and confidence. The interface does not display a separate Potential Moves list.</w:t>
+      </w:r>
+    </w:p>
+    <w:p>
+      <w:pPr/>
+      <w:r>
+        <w:t>The section includes dedicated Team Strengths and Areas to Improve reviews beneath the championship recommendation. Each review begins with analytical plain text explaining why the finding matters to championship odds, then presents structured supporting metrics underneath. The separate Position Group Reviews block is no longer displayed because the position-level findings are incorporated into strengths and weaknesses.</w:t>
+      </w:r>
+    </w:p>
+    <w:p>
+      <w:r>
+        <w:t>Below the recommendation, the application renders narrative-first reviews for Quarterback, Running Back, Wide Receiver, Tight End, Flex, Bench Depth, and Draft Capital. Each review includes a derived status, recommended action, plain-language assessment, and structured supporting metrics. Titles no longer use the phrase With Evidence; the supporting data remains visible beneath the narrative.</w:t>
       </w:r>
     </w:p>
     <w:p>
@@ -505,12 +542,12 @@
     </w:p>
     <w:p>
       <w:r>
-        <w:t>Fantasy Football Intelligence Hub is a static, browser-based dynasty football analysis application published through GitHub Pages. The Version 2.0 product analyzes public Sleeper leagues, joins projection and dynasty-value sources, builds legal optimal lineups, ranks teams, evaluates risk and draft capital, generates player tiers and evidence-backed recommendations, and exports user-controlled reports.</w:t>
+        <w:t>Fantasy Football Intelligence Hub is a static, browser-based dynasty football analysis application published through GitHub Pages. Version 2.1 analyzes public Sleeper leagues, automatically detects league configuration and linked history, joins projection and dynasty-value sources, builds legal optimal lineups, ranks teams, evaluates risk and draft capital, presents current-season and historical franchise performance, generates player tiers and evidence-backed recommendations, and exports user-controlled reports.</w:t>
       </w:r>
     </w:p>
     <w:p>
       <w:r>
-        <w:t>During the Version 2.0 implementation cycle, the application moved from a single local HTML file with inline code to a production repository with external CSS, ES modules, provider-specific integrations, page-specific renderers, automated same-origin data snapshots, Node tests, project validation, centralized error handling, and scheduled GitHub Actions. The product version remains 2.0.0 because these changes complete and document the Version 2.0 architecture rather than introduce a separately marketed feature release.</w:t>
+        <w:t>Version 2.1 builds on the Version 2.0 modular architecture. It simplifies the league-analysis landing page, automatically detects league setup and linked history, adds a paced loading workflow, reorganizes current-season and historical dashboard summaries, expands League Power Rankings with positional ranks, and introduces a Championship Outlook &amp; Roster Review with narrative-first strengths and weaknesses followed by structured supporting metrics.</w:t>
       </w:r>
     </w:p>
     <w:tbl>
@@ -1317,7 +1354,7 @@
         <w:pStyle w:val="ListNumber"/>
       </w:pPr>
       <w:r>
-        <w:t>The user enters a league ID and selects optional analysis settings.</w:t>
+        <w:t>The user enters a public Sleeper league ID, optionally expands advanced overrides, and starts analysis through one primary Analyze League action.</w:t>
       </w:r>
     </w:p>
     <w:p>
@@ -1325,7 +1362,7 @@
         <w:pStyle w:val="ListNumber"/>
       </w:pPr>
       <w:r>
-        <w:t>analyze.js retrieves league-specific Sleeper data and shared provider data.</w:t>
+        <w:t>analyze.js retrieves league-specific Sleeper data and shared provider data, detects league setup and linked history, and creates current-season and historical team summaries.</w:t>
       </w:r>
     </w:p>
     <w:p>
@@ -1341,7 +1378,7 @@
         <w:pStyle w:val="ListNumber"/>
       </w:pPr>
       <w:r>
-        <w:t>league.js and tiers.js build normalized player, team, lineup, pick, score, risk, tier, and insight objects.</w:t>
+        <w:t>league.js and tiers.js build normalized player, team, lineup, pick, score, risk, tier, insight, standing, and linked-season historical-summary objects.</w:t>
       </w:r>
     </w:p>
     <w:p>
@@ -2958,14 +2995,8 @@
             <w:vAlign w:val="top"/>
           </w:tcPr>
           <w:p>
-            <w:pPr>
-              <w:spacing w:after="0"/>
-            </w:pPr>
-            <w:r>
-              <w:rPr>
-                <w:sz w:val="16"/>
-              </w:rPr>
-              <w:t>League ID, format override, history depth, future pick horizon, ranking weights, refresh, cache load, and cache clear.</w:t>
+            <w:r>
+              <w:t>One primary Analyze League action; automatic format, linked-season, and future-pick detection; Contender Ranking Weights; advanced overrides; paced loading; and secondary previous-report/live-data actions.</w:t>
             </w:r>
           </w:p>
         </w:tc>
@@ -3030,14 +3061,8 @@
             <w:vAlign w:val="top"/>
           </w:tcPr>
           <w:p>
-            <w:pPr>
-              <w:spacing w:after="0"/>
-            </w:pPr>
-            <w:r>
-              <w:rPr>
-                <w:sz w:val="16"/>
-              </w:rPr>
-              <w:t>Rankings, classification, KPIs, projected PPG chart, and evidence-backed strategy.</w:t>
+            <w:r>
+              <w:t>Separate Current Season and Overall Performance summaries; full-width League Power Rankings that retain Class, EPPG, Depth, PF, Dynasty Value, Risk, Future 1sts, Contender Index, and Dynasty Rank while adding gap to leader, QB/RB/WR/TE/FLEX ranks, biggest strength, and biggest weakness; responsive ranking cards on mobile.</w:t>
             </w:r>
           </w:p>
         </w:tc>
@@ -3066,14 +3091,8 @@
             <w:vAlign w:val="top"/>
           </w:tcPr>
           <w:p>
-            <w:pPr>
-              <w:spacing w:after="0"/>
-            </w:pPr>
-            <w:r>
-              <w:rPr>
-                <w:sz w:val="16"/>
-              </w:rPr>
-              <w:t>Strengths, weaknesses, build-around and shop candidates, lineup, values, depth, risk, and picks.</w:t>
+            <w:r>
+              <w:t>Championship Outlook recommendation with expanded strategic rationale, an explicit hold/no-move outcome when appropriate, confidence, and supporting metrics; analytical Team Strengths and Areas to Improve reviews with structured supporting metrics.</w:t>
             </w:r>
           </w:p>
         </w:tc>
@@ -5340,14 +5359,8 @@
             <w:vAlign w:val="top"/>
           </w:tcPr>
           <w:p>
-            <w:pPr>
-              <w:spacing w:after="0"/>
-            </w:pPr>
-            <w:r>
-              <w:rPr>
-                <w:sz w:val="16"/>
-              </w:rPr>
-              <w:t>Eligibility, percentiles, risk, optimal lineup, and traded-pick ownership.</w:t>
+            <w:r>
+              <w:t>Eligibility, percentiles, risk, optimal lineup, traded-pick ownership, setup detection, future-pick horizon, standings, and linked-season historical summaries.</w:t>
             </w:r>
           </w:p>
         </w:tc>
@@ -5376,14 +5389,8 @@
             <w:vAlign w:val="top"/>
           </w:tcPr>
           <w:p>
-            <w:pPr>
-              <w:spacing w:after="0"/>
-            </w:pPr>
-            <w:r>
-              <w:rPr>
-                <w:sz w:val="16"/>
-              </w:rPr>
-              <w:t>Tier scoring, sort order, and inactive-player exclusion.</w:t>
+            <w:r>
+              <w:t>Tier scoring, sort order, inactive-player exclusion, championship-outlook generation, potential-move output, and seven position-group reviews.</w:t>
             </w:r>
           </w:p>
         </w:tc>
@@ -7196,6 +7203,48 @@
           </w:p>
         </w:tc>
       </w:tr>
+      <w:tr>
+        <w:tc>
+          <w:tcPr>
+            <w:tcW w:type="dxa" w:w="2556"/>
+          </w:tcPr>
+          <w:p>
+            <w:r>
+              <w:t>detectedSetup</w:t>
+            </w:r>
+          </w:p>
+        </w:tc>
+        <w:tc>
+          <w:tcPr>
+            <w:tcW w:type="dxa" w:w="2556"/>
+          </w:tcPr>
+          <w:p>
+            <w:r>
+              <w:t>object</w:t>
+            </w:r>
+          </w:p>
+        </w:tc>
+        <w:tc>
+          <w:tcPr>
+            <w:tcW w:type="dxa" w:w="2556"/>
+          </w:tcPr>
+          <w:p>
+            <w:r>
+              <w:t>Sleeper league + linked history</w:t>
+            </w:r>
+          </w:p>
+        </w:tc>
+        <w:tc>
+          <w:tcPr>
+            <w:tcW w:type="dxa" w:w="2556"/>
+          </w:tcPr>
+          <w:p>
+            <w:r>
+              <w:t>Detected team count, format, starter count, IDP presence, history range, and future-pick range.</w:t>
+            </w:r>
+          </w:p>
+        </w:tc>
+      </w:tr>
     </w:tbl>
     <w:p/>
     <w:p>
@@ -9255,6 +9304,116 @@
                 <w:sz w:val="14"/>
               </w:rPr>
               <w:t>Evidence-backed strengths, weaknesses, strategy, build, and shop candidates</w:t>
+            </w:r>
+          </w:p>
+        </w:tc>
+      </w:tr>
+      <w:tr>
+        <w:tc>
+          <w:tcPr>
+            <w:tcW w:type="dxa" w:w="5112"/>
+          </w:tcPr>
+          <w:p>
+            <w:r>
+              <w:t>historical</w:t>
+            </w:r>
+          </w:p>
+        </w:tc>
+        <w:tc>
+          <w:tcPr>
+            <w:tcW w:type="dxa" w:w="5112"/>
+          </w:tcPr>
+          <w:p>
+            <w:r>
+              <w:t>Linked-season franchise summary: seasons matched, completed seasons, games, wins, losses, ties, points, average PPG, average finish, historical PPG rank, league-average PPG, current standing, and current record.</w:t>
+            </w:r>
+          </w:p>
+        </w:tc>
+      </w:tr>
+      <w:tr>
+        <w:tc>
+          <w:tcPr>
+            <w:tcW w:type="dxa" w:w="5112"/>
+          </w:tcPr>
+          <w:p>
+            <w:r>
+              <w:t>positionRanks</w:t>
+            </w:r>
+          </w:p>
+        </w:tc>
+        <w:tc>
+          <w:tcPr>
+            <w:tcW w:type="dxa" w:w="5112"/>
+          </w:tcPr>
+          <w:p>
+            <w:r>
+              <w:t>League rank for QB, RB, WR, TE, and FLEX projected starter output.</w:t>
+            </w:r>
+          </w:p>
+        </w:tc>
+      </w:tr>
+      <w:tr>
+        <w:tc>
+          <w:tcPr>
+            <w:tcW w:type="dxa" w:w="5112"/>
+          </w:tcPr>
+          <w:p>
+            <w:r>
+              <w:t>biggestStrength, biggestWeakness</w:t>
+            </w:r>
+          </w:p>
+        </w:tc>
+        <w:tc>
+          <w:tcPr>
+            <w:tcW w:type="dxa" w:w="5112"/>
+          </w:tcPr>
+          <w:p>
+            <w:r>
+              <w:t>Best and worst positional ranks used in the full-width power-ranking report.</w:t>
+            </w:r>
+          </w:p>
+        </w:tc>
+      </w:tr>
+      <w:tr>
+        <w:tc>
+          <w:tcPr>
+            <w:tcW w:type="dxa" w:w="5112"/>
+          </w:tcPr>
+          <w:p>
+            <w:r>
+              <w:t>insights.championshipOutlook</w:t>
+            </w:r>
+          </w:p>
+        </w:tc>
+        <w:tc>
+          <w:tcPr>
+            <w:tcW w:type="dxa" w:w="5112"/>
+          </w:tcPr>
+          <w:p>
+            <w:r>
+              <w:t>Recommendation title, expanded explanation, confidence, and summary metrics. No separate potential-moves list is rendered.</w:t>
+            </w:r>
+          </w:p>
+        </w:tc>
+      </w:tr>
+      <w:tr>
+        <w:tc>
+          <w:tcPr>
+            <w:tcW w:type="dxa" w:w="5112"/>
+          </w:tcPr>
+          <w:p>
+            <w:r>
+              <w:t>insights.positionReviews</w:t>
+            </w:r>
+          </w:p>
+        </w:tc>
+        <w:tc>
+          <w:tcPr>
+            <w:tcW w:type="dxa" w:w="5112"/>
+          </w:tcPr>
+          <w:p>
+            <w:r>
+              <w:t>Narrative and structured review objects for QB, RB, WR, TE, FLEX, Bench Depth, and Draft Capital.</w:t>
             </w:r>
           </w:p>
         </w:tc>
@@ -11068,6 +11227,48 @@
                 <w:sz w:val="15"/>
               </w:rPr>
               <w:t>Documented external CSS and ES-module architecture, provider and view modules, centralized errors, Node tests, local snapshots, GitHub Actions automation, GitHub Pages deployment, per-file JavaScript READMEs, updated data dictionary, and revised architecture diagram. No application-version increment.</w:t>
+            </w:r>
+          </w:p>
+        </w:tc>
+      </w:tr>
+      <w:tr>
+        <w:tc>
+          <w:tcPr>
+            <w:tcW w:type="dxa" w:w="2556"/>
+          </w:tcPr>
+          <w:p>
+            <w:r>
+              <w:t>July 28, 2026</w:t>
+            </w:r>
+          </w:p>
+        </w:tc>
+        <w:tc>
+          <w:tcPr>
+            <w:tcW w:type="dxa" w:w="2556"/>
+          </w:tcPr>
+          <w:p>
+            <w:r>
+              <w:t>2.1</w:t>
+            </w:r>
+          </w:p>
+        </w:tc>
+        <w:tc>
+          <w:tcPr>
+            <w:tcW w:type="dxa" w:w="2556"/>
+          </w:tcPr>
+          <w:p>
+            <w:r>
+              <w:t>v2.1 / 2.1.0</w:t>
+            </w:r>
+          </w:p>
+        </w:tc>
+        <w:tc>
+          <w:tcPr>
+            <w:tcW w:type="dxa" w:w="2556"/>
+          </w:tcPr>
+          <w:p>
+            <w:r>
+              <w:t>Released landing-page simplification and automatic league detection; added paced loading, Current Season and Overall Performance summaries, historical franchise metrics, full-width League Power Rankings, QB/RB/WR/TE/FLEX ranks, biggest strength and weakness, and the Championship Outlook &amp; Roster Review.</w:t>
             </w:r>
           </w:p>
         </w:tc>
@@ -11181,7 +11382,7 @@
       <w:jc w:val="center"/>
     </w:pPr>
     <w:r>
-      <w:t>Fantasy Football Intelligence Hub | Software Design Specification | Version 2.0</w:t>
+      <w:t>Fantasy Football Intelligence Hub | Software Design Specification | Version 2.1</w:t>
     </w:r>
   </w:p>
 </w:ftr>

</xml_diff>

<commit_message>
Redesign global header and page navigation
</commit_message>
<xml_diff>
--- a/docs/Fantasy_Football_Intelligence_Hub_Software_Design_Specification.docx
+++ b/docs/Fantasy_Football_Intelligence_Hub_Software_Design_Specification.docx
@@ -112,7 +112,7 @@
           </w:tcPr>
           <w:p>
             <w:r>
-              <w:t>2.1</w:t>
+              <w:t>2.2</w:t>
             </w:r>
           </w:p>
         </w:tc>
@@ -142,7 +142,7 @@
           </w:tcPr>
           <w:p>
             <w:r>
-              <w:t>Fantasy Football Intelligence Hub v2.1 / APP_VERSION 2.1.0</w:t>
+              <w:t>Fantasy Football Intelligence Hub v2.2 / APP_VERSION 2.2.0</w:t>
             </w:r>
           </w:p>
         </w:tc>
@@ -172,7 +172,7 @@
           </w:tcPr>
           <w:p>
             <w:r>
-              <w:t>Living design specification - Version 2.1 feature release</w:t>
+              <w:t>Living design specification - Version 2.2 header release</w:t>
             </w:r>
           </w:p>
         </w:tc>
@@ -370,7 +370,7 @@
           </w:tcPr>
           <w:p>
             <w:r>
-              <w:t>Version-control decision: Version 2.1.0 is a minor feature release. It combines the simplified league-analysis landing experience, automatic setup detection, paced loading workflow, and dashboard current-season and historical performance summaries. The Version 2.0 architecture remains the underlying system baseline.</w:t>
+              <w:t>Version-control decision: Version 2.2.0 is a minor user-interface release. It consolidates navigation and league context into a single responsive global header while preserving the Version 2.1 dashboard and analytical behavior.</w:t>
             </w:r>
           </w:p>
         </w:tc>
@@ -478,8 +478,16 @@
       </w:r>
     </w:p>
     <w:p>
+      <w:pPr>
+        <w:pStyle w:val="Heading2"/>
+      </w:pPr>
       <w:r>
-        <w:t>Below the recommendation, the application renders narrative-first reviews for Quarterback, Running Back, Wide Receiver, Tight End, Flex, Bench Depth, and Draft Capital. Each review includes a derived status, recommended action, plain-language assessment, and structured supporting metrics. Titles no longer use the phrase With Evidence; the supporting data remains visible beneath the narrative.</w:t>
+        <w:t>5.4 Version 2.2 Global Header</w:t>
+      </w:r>
+    </w:p>
+    <w:p>
+      <w:r>
+        <w:t>The application uses one sticky responsive header instead of a separate branding header and report-tab banner. The logo is the product identifier. The application context area includes a grouped report-page selector, league name, detected settings summary, analysis update timestamp, Focus Team selector, data status, version badge, and an overflow menu for lower-frequency actions. On mobile, the header reduces to the compact logo, page selector, and overflow menu. Page changes update the URL hash, browser Back and Forward navigation, and local page preference while preserving the selected focus team.</w:t>
       </w:r>
     </w:p>
     <w:p>
@@ -542,12 +550,12 @@
     </w:p>
     <w:p>
       <w:r>
-        <w:t>Fantasy Football Intelligence Hub is a static, browser-based dynasty football analysis application published through GitHub Pages. Version 2.1 analyzes public Sleeper leagues, automatically detects league configuration and linked history, joins projection and dynasty-value sources, builds legal optimal lineups, ranks teams, evaluates risk and draft capital, presents current-season and historical franchise performance, generates player tiers and evidence-backed recommendations, and exports user-controlled reports.</w:t>
+        <w:t>Fantasy Football Intelligence Hub is a static, browser-based dynasty football analysis application published through GitHub Pages. Version 2.2 analyzes public Sleeper leagues, automatically detects league configuration and linked history, joins projection and dynasty-value sources, builds legal optimal lineups, ranks teams, evaluates risk and draft capital, presents current-season and historical franchise performance, generates player tiers and analytical recommendations, and exports user-controlled reports.</w:t>
       </w:r>
     </w:p>
     <w:p>
       <w:r>
-        <w:t>Version 2.1 builds on the Version 2.0 modular architecture. It simplifies the league-analysis landing page, automatically detects league setup and linked history, adds a paced loading workflow, reorganizes current-season and historical dashboard summaries, expands League Power Rankings with positional ranks, and introduces a Championship Outlook &amp; Roster Review with narrative-first strengths and weaknesses followed by structured supporting metrics.</w:t>
+        <w:t>Version 2.2 builds on the Version 2.1 feature release by consolidating persistent application navigation and league context into a single sticky responsive header. The prior standalone page-selector banner is removed. The grouped page selector, league details, Focus Team selector, data status, version badge, and overflow actions are now available from one shared shell across all report pages.</w:t>
       </w:r>
     </w:p>
     <w:tbl>
@@ -726,7 +734,7 @@
     </w:p>
     <w:p>
       <w:r>
-        <w:t>Figure 1 shows the released Version 2.0 architecture after GitHub publication and modularization.</w:t>
+        <w:t>Figure 1 shows the Version 2.x static architecture after GitHub publication and modularization.</w:t>
       </w:r>
     </w:p>
     <w:p>
@@ -770,10 +778,7 @@
         <w:jc w:val="center"/>
       </w:pPr>
       <w:r>
-        <w:rPr>
-          <w:i/>
-        </w:rPr>
-        <w:t>Figure 1. Fantasy Football Intelligence Hub Version 2.0 published static architecture and data flow.</w:t>
+        <w:t>Figure 1. Fantasy Football Intelligence Hub Version 2.x published static architecture and data flow.</w:t>
       </w:r>
     </w:p>
     <w:p>
@@ -940,14 +945,8 @@
             <w:vAlign w:val="top"/>
           </w:tcPr>
           <w:p>
-            <w:pPr>
-              <w:spacing w:after="0"/>
-            </w:pPr>
-            <w:r>
-              <w:rPr>
-                <w:sz w:val="15"/>
-              </w:rPr>
-              <w:t>Provide branded single-page structure and responsive styles.</w:t>
+            <w:r>
+              <w:t>Provide branded single-page structure, sticky global header, grouped navigation, and responsive styles.</w:t>
             </w:r>
           </w:p>
         </w:tc>
@@ -993,14 +992,8 @@
             <w:vAlign w:val="top"/>
           </w:tcPr>
           <w:p>
-            <w:pPr>
-              <w:spacing w:after="0"/>
-            </w:pPr>
-            <w:r>
-              <w:rPr>
-                <w:sz w:val="15"/>
-              </w:rPr>
-              <w:t>Register events, exports, sorting, startup, and global error listeners.</w:t>
+            <w:r>
+              <w:t>Register header events, page history, exports, sorting, startup, and global error listeners.</w:t>
             </w:r>
           </w:p>
         </w:tc>
@@ -1394,7 +1387,7 @@
         <w:pStyle w:val="ListNumber"/>
       </w:pPr>
       <w:r>
-        <w:t>Completed analysis is cached in IndexedDB and can be exported as JSON, CSV, embedded HTML, or print/PDF.</w:t>
+        <w:t>Completed analysis is cached in IndexedDB and can be exported as JSON, CSV, embedded HTML, or print/PDF. The shared header synchronizes report-page selection with browser history and local view preference.</w:t>
       </w:r>
     </w:p>
     <w:p>
@@ -1548,14 +1541,8 @@
             <w:vAlign w:val="top"/>
           </w:tcPr>
           <w:p>
-            <w:pPr>
-              <w:spacing w:after="0"/>
-            </w:pPr>
-            <w:r>
-              <w:rPr>
-                <w:sz w:val="13"/>
-              </w:rPr>
-              <w:t>Browser entry point. Registers UI event handlers, export actions, table sorting, global error listeners, and embedded-report startup.</w:t>
+            <w:r>
+              <w:t>Browser entry point. Registers grouped page navigation, Focus Team changes, overflow actions, exports, table sorting, browser history, global errors, and embedded-report startup.</w:t>
             </w:r>
           </w:p>
         </w:tc>
@@ -1866,14 +1853,8 @@
             <w:vAlign w:val="top"/>
           </w:tcPr>
           <w:p>
-            <w:pPr>
-              <w:spacing w:after="0"/>
-            </w:pPr>
-            <w:r>
-              <w:rPr>
-                <w:sz w:val="13"/>
-              </w:rPr>
-              <w:t>Top-level presentation orchestrator.</w:t>
+            <w:r>
+              <w:t>Top-level presentation and application-shell orchestrator, including header context and persistent active-view behavior.</w:t>
             </w:r>
           </w:p>
         </w:tc>
@@ -3025,14 +3006,8 @@
             <w:vAlign w:val="top"/>
           </w:tcPr>
           <w:p>
-            <w:pPr>
-              <w:spacing w:after="0"/>
-            </w:pPr>
-            <w:r>
-              <w:rPr>
-                <w:sz w:val="16"/>
-              </w:rPr>
-              <w:t>Logo, version panel, focus-team selector, refresh, and change-league controls.</w:t>
+            <w:r>
+              <w:t>Sticky logo-based application header with grouped report-page selector, league name, detected settings, analysis timestamp, Focus Team selector, data status, version badge, responsive behavior, browser-history synchronization, and overflow actions.</w:t>
             </w:r>
           </w:p>
         </w:tc>
@@ -5391,6 +5366,28 @@
           <w:p>
             <w:r>
               <w:t>Tier scoring, sort order, inactive-player exclusion, championship-outlook generation, potential-move output, and seven position-group reviews.</w:t>
+            </w:r>
+          </w:p>
+        </w:tc>
+      </w:tr>
+      <w:tr>
+        <w:tc>
+          <w:tcPr>
+            <w:tcW w:type="dxa" w:w="5112"/>
+          </w:tcPr>
+          <w:p>
+            <w:r>
+              <w:t>js/tests/header.test.js</w:t>
+            </w:r>
+          </w:p>
+        </w:tc>
+        <w:tc>
+          <w:tcPr>
+            <w:tcW w:type="dxa" w:w="5112"/>
+          </w:tcPr>
+          <w:p>
+            <w:r>
+              <w:t>Global header structure, removal of legacy page tabs, and Version 2.2 consistency.</w:t>
             </w:r>
           </w:p>
         </w:tc>
@@ -10887,14 +10884,8 @@
             <w:vAlign w:val="top"/>
           </w:tcPr>
           <w:p>
-            <w:pPr>
-              <w:spacing w:after="0"/>
-            </w:pPr>
-            <w:r>
-              <w:rPr>
-                <w:sz w:val="14"/>
-              </w:rPr>
-              <w:t>Keep Version 2.0</w:t>
+            <w:r>
+              <w:t>Release Version 2.2</w:t>
             </w:r>
           </w:p>
         </w:tc>
@@ -10904,14 +10895,8 @@
             <w:vAlign w:val="top"/>
           </w:tcPr>
           <w:p>
-            <w:pPr>
-              <w:spacing w:after="0"/>
-            </w:pPr>
-            <w:r>
-              <w:rPr>
-                <w:sz w:val="14"/>
-              </w:rPr>
-              <w:t>Changes complete the approved Version 2.0 architecture.</w:t>
+            <w:r>
+              <w:t>The global header is a material user-facing navigation and responsive-shell enhancement.</w:t>
             </w:r>
           </w:p>
         </w:tc>
@@ -10921,14 +10906,8 @@
             <w:vAlign w:val="top"/>
           </w:tcPr>
           <w:p>
-            <w:pPr>
-              <w:spacing w:after="0"/>
-            </w:pPr>
-            <w:r>
-              <w:rPr>
-                <w:sz w:val="14"/>
-              </w:rPr>
-              <w:t>No product-version increment in this documentation update.</w:t>
+            <w:r>
+              <w:t>Application and documentation versions advance to 2.2.0.</w:t>
             </w:r>
           </w:p>
         </w:tc>
@@ -11269,6 +11248,48 @@
           <w:p>
             <w:r>
               <w:t>Released landing-page simplification and automatic league detection; added paced loading, Current Season and Overall Performance summaries, historical franchise metrics, full-width League Power Rankings, QB/RB/WR/TE/FLEX ranks, biggest strength and weakness, and the Championship Outlook &amp; Roster Review.</w:t>
+            </w:r>
+          </w:p>
+        </w:tc>
+      </w:tr>
+      <w:tr>
+        <w:tc>
+          <w:tcPr>
+            <w:tcW w:type="dxa" w:w="2556"/>
+          </w:tcPr>
+          <w:p>
+            <w:r>
+              <w:t>July 28, 2026</w:t>
+            </w:r>
+          </w:p>
+        </w:tc>
+        <w:tc>
+          <w:tcPr>
+            <w:tcW w:type="dxa" w:w="2556"/>
+          </w:tcPr>
+          <w:p>
+            <w:r>
+              <w:t>2.2</w:t>
+            </w:r>
+          </w:p>
+        </w:tc>
+        <w:tc>
+          <w:tcPr>
+            <w:tcW w:type="dxa" w:w="2556"/>
+          </w:tcPr>
+          <w:p>
+            <w:r>
+              <w:t>v2.2 / 2.2.0</w:t>
+            </w:r>
+          </w:p>
+        </w:tc>
+        <w:tc>
+          <w:tcPr>
+            <w:tcW w:type="dxa" w:w="2556"/>
+          </w:tcPr>
+          <w:p>
+            <w:r>
+              <w:t>Replaced the standalone page-selector banner with a sticky responsive global header containing grouped page navigation, league context, Focus Team selection, data status, version, overflow actions, browser-history support, and active-page persistence.</w:t>
             </w:r>
           </w:p>
         </w:tc>
@@ -11365,6 +11386,7 @@
     </w:p>
     <w:sectPr>
       <w:footerReference w:type="default" r:id="rId10"/>
+      <w:headerReference w:type="default" r:id="rId11"/>
       <w:pgSz w:w="12240" w:h="15840"/>
       <w:pgMar w:top="936" w:right="1008" w:bottom="936" w:left="1008" w:header="720" w:footer="720" w:gutter="0"/>
       <w:cols w:space="720"/>
@@ -11382,10 +11404,20 @@
       <w:jc w:val="center"/>
     </w:pPr>
     <w:r>
-      <w:t>Fantasy Football Intelligence Hub | Software Design Specification | Version 2.1</w:t>
+      <w:t>Fantasy Football Intelligence Hub | Software Design Specification | Version 2.2</w:t>
     </w:r>
   </w:p>
 </w:ftr>
+</file>
+
+<file path=word/header1.xml><?xml version="1.0" encoding="utf-8"?>
+<w:hdr xmlns:m="http://schemas.openxmlformats.org/officeDocument/2006/math" xmlns:mc="http://schemas.openxmlformats.org/markup-compatibility/2006" xmlns:mo="http://schemas.microsoft.com/office/mac/office/2008/main" xmlns:mv="urn:schemas-microsoft-com:mac:vml" xmlns:o="urn:schemas-microsoft-com:office:office" xmlns:r="http://schemas.openxmlformats.org/officeDocument/2006/relationships" xmlns:v="urn:schemas-microsoft-com:vml" xmlns:w10="urn:schemas-microsoft-com:office:word" xmlns:w14="http://schemas.microsoft.com/office/word/2010/wordml" xmlns:w="http://schemas.openxmlformats.org/wordprocessingml/2006/main" xmlns:wne="http://schemas.microsoft.com/office/word/2006/wordml" xmlns:wp14="http://schemas.microsoft.com/office/word/2010/wordprocessingDrawing" xmlns:wp="http://schemas.openxmlformats.org/drawingml/2006/wordprocessingDrawing" xmlns:wpc="http://schemas.microsoft.com/office/word/2010/wordprocessingCanvas" xmlns:wpg="http://schemas.microsoft.com/office/word/2010/wordprocessingGroup" xmlns:wpi="http://schemas.microsoft.com/office/word/2010/wordprocessingInk" xmlns:wps="http://schemas.microsoft.com/office/word/2010/wordprocessingShape" mc:Ignorable="w14 wp14">
+  <w:p>
+    <w:pPr>
+      <w:pStyle w:val="Header"/>
+    </w:pPr>
+  </w:p>
+</w:hdr>
 </file>
 
 <file path=word/numbering.xml><?xml version="1.0" encoding="utf-8"?>

</xml_diff>

<commit_message>
Fix active tab styling and header starter count for v2.2.1
</commit_message>
<xml_diff>
--- a/docs/Fantasy_Football_Intelligence_Hub_Software_Design_Specification.docx
+++ b/docs/Fantasy_Football_Intelligence_Hub_Software_Design_Specification.docx
@@ -112,7 +112,7 @@
           </w:tcPr>
           <w:p>
             <w:r>
-              <w:t>2.2</w:t>
+              <w:t>2.2.1</w:t>
             </w:r>
           </w:p>
         </w:tc>
@@ -142,7 +142,7 @@
           </w:tcPr>
           <w:p>
             <w:r>
-              <w:t>Fantasy Football Intelligence Hub v2.2 / APP_VERSION 2.2.0</w:t>
+              <w:t>Fantasy Football Intelligence Hub v2.2.1 / APP_VERSION 2.2.1</w:t>
             </w:r>
           </w:p>
         </w:tc>
@@ -172,7 +172,7 @@
           </w:tcPr>
           <w:p>
             <w:r>
-              <w:t>Living design specification - Version 2.2 header release</w:t>
+              <w:t>Living design specification - Version 2.2.1 patch release</w:t>
             </w:r>
           </w:p>
         </w:tc>
@@ -370,7 +370,19 @@
           </w:tcPr>
           <w:p>
             <w:r>
-              <w:t>Version-control decision: Version 2.2.0 is a minor user-interface release. It consolidates navigation and league context into a single responsive global header while preserving the Version 2.1 dashboard and analytical behavior.</w:t>
+              <w:t>Version-control decision: Version 2.2.1 is a patch release. It corrects active-tab layout behavior and header starter-count metadata without changing the Version 2.2 global header architecture or the Version 2.1 analytics.</w:t>
+            </w:r>
+          </w:p>
+        </w:tc>
+      </w:tr>
+      <w:tr>
+        <w:tc>
+          <w:tcPr>
+            <w:tcW w:type="dxa" w:w="10224"/>
+          </w:tcPr>
+          <w:p>
+            <w:r>
+              <w:t>2.2.1</w:t>
             </w:r>
           </w:p>
         </w:tc>
@@ -11384,6 +11396,136 @@
         <w:t>Confirm GitHub Pages and the Update fantasy football data workflow succeed.</w:t>
       </w:r>
     </w:p>
+    <w:p>
+      <w:pPr>
+        <w:pStyle w:val="Heading1"/>
+      </w:pPr>
+      <w:r>
+        <w:t>Version 2.2.1 Active Tab Style Patch</w:t>
+      </w:r>
+    </w:p>
+    <w:p>
+      <w:r>
+        <w:t>Version 2.2.1 corrects the active state of the global report tabs without changing navigation behavior or the desktop header structure.</w:t>
+      </w:r>
+    </w:p>
+    <w:p>
+      <w:pPr>
+        <w:pStyle w:val="ListBullet"/>
+      </w:pPr>
+      <w:r>
+        <w:t>Active and inactive tabs use the same height, width allocation, padding, margin, border radius, and vertical position.</w:t>
+      </w:r>
+    </w:p>
+    <w:p>
+      <w:pPr>
+        <w:pStyle w:val="ListBullet"/>
+      </w:pPr>
+      <w:r>
+        <w:t>The active state changes only the background to the product blue, the text to white, and the font weight to bold.</w:t>
+      </w:r>
+    </w:p>
+    <w:p>
+      <w:pPr>
+        <w:pStyle w:val="ListBullet"/>
+      </w:pPr>
+      <w:r>
+        <w:t>Raised positioning, active-state height growth, negative overlap, visual bridge pseudo-elements, and active-state shadows are removed.</w:t>
+      </w:r>
+    </w:p>
+    <w:p>
+      <w:pPr>
+        <w:pStyle w:val="ListBullet"/>
+      </w:pPr>
+      <w:r>
+        <w:t>The tab row no longer overlaps or covers the report content below it.</w:t>
+      </w:r>
+    </w:p>
+    <w:p>
+      <w:pPr>
+        <w:pStyle w:val="ListBullet"/>
+      </w:pPr>
+      <w:r>
+        <w:t>Tab click navigation, focus-team persistence, URL hash state, and browser Back/Forward behavior remain unchanged.</w:t>
+      </w:r>
+    </w:p>
+    <w:p>
+      <w:pPr>
+        <w:pStyle w:val="ListBullet"/>
+      </w:pPr>
+      <w:r>
+        <w:t>Regression tests verify version consistency, fixed dimensions, color-only active styling, and absence of the previous pseudo-element bridge.</w:t>
+      </w:r>
+    </w:p>
+    <w:p>
+      <w:pPr>
+        <w:pStyle w:val="Heading2"/>
+      </w:pPr>
+      <w:r>
+        <w:t>Version 2.2.1 Header Starter Count Metadata Correction</w:t>
+      </w:r>
+    </w:p>
+    <w:p>
+      <w:pPr>
+        <w:pStyle w:val="ListBullet"/>
+      </w:pPr>
+      <w:r>
+        <w:t>The league header resolves starter count from a valid stored starterCount value, detectedSetup.starterCount, starterSlots, rosterSlots, or Sleeper roster_positions.</w:t>
+      </w:r>
+    </w:p>
+    <w:p>
+      <w:pPr>
+        <w:pStyle w:val="ListBullet"/>
+      </w:pPr>
+      <w:r>
+        <w:t>Bench, IR, reserve, and taxi slots are excluded from derived starter counts. Legal offensive, kicker, defense, Superflex, and IDP starter slots are included.</w:t>
+      </w:r>
+    </w:p>
+    <w:p>
+      <w:pPr>
+        <w:pStyle w:val="ListBullet"/>
+      </w:pPr>
+      <w:r>
+        <w:t>New analyses persist starterCount and starterSlots alongside rosterSlots so saved reports retain explicit lineup metadata.</w:t>
+      </w:r>
+    </w:p>
+    <w:p>
+      <w:pPr>
+        <w:pStyle w:val="ListBullet"/>
+      </w:pPr>
+      <w:r>
+        <w:t>When no valid starter count can be resolved, the header omits the starter-count segment instead of displaying Starter count unavailable.</w:t>
+      </w:r>
+    </w:p>
+    <w:p>
+      <w:pPr>
+        <w:pStyle w:val="ListBullet"/>
+      </w:pPr>
+      <w:r>
+        <w:t>For the referenced 12-team 1QB PPR league, the header renders 12 teams · 1QB PPR · Start 10.</w:t>
+      </w:r>
+    </w:p>
+    <w:p>
+      <w:pPr>
+        <w:pStyle w:val="ListBullet"/>
+      </w:pPr>
+      <w:r>
+        <w:t>Regression tests cover direct stored values, detected setup fallback, roster-slot arrays, Sleeper roster positions, excluded reserve slots, and unresolved metadata.</w:t>
+      </w:r>
+    </w:p>
+    <w:p>
+      <w:pPr>
+        <w:pStyle w:val="Heading3"/>
+      </w:pPr>
+      <w:r>
+        <w:t>Starter Count Derived Field</w:t>
+      </w:r>
+    </w:p>
+    <w:p>
+      <w:r>
+        <w:t>starterCount resolution order: explicit analysis starterCount; detectedSetup.starterCount; starterSlots; rosterSlots; direct or nested Sleeper roster_positions. The derived output is a positive integer or null.</w:t>
+      </w:r>
+    </w:p>
     <w:sectPr>
       <w:footerReference w:type="default" r:id="rId10"/>
       <w:headerReference w:type="default" r:id="rId11"/>
@@ -11404,7 +11546,7 @@
       <w:jc w:val="center"/>
     </w:pPr>
     <w:r>
-      <w:t>Fantasy Football Intelligence Hub | Software Design Specification | Version 2.2</w:t>
+      <w:t>Fantasy Football Intelligence Hub | Software Design Specification | Version 2.2.1</w:t>
     </w:r>
   </w:p>
 </w:ftr>

</xml_diff>

<commit_message>
feat: release stateless Sleeper acquisition v2.3.0
</commit_message>
<xml_diff>
--- a/docs/Fantasy_Football_Intelligence_Hub_Software_Design_Specification.docx
+++ b/docs/Fantasy_Football_Intelligence_Hub_Software_Design_Specification.docx
@@ -112,7 +112,7 @@
           </w:tcPr>
           <w:p>
             <w:r>
-              <w:t>2.2.1</w:t>
+              <w:t>2.3.0</w:t>
             </w:r>
           </w:p>
         </w:tc>
@@ -142,7 +142,7 @@
           </w:tcPr>
           <w:p>
             <w:r>
-              <w:t>Fantasy Football Intelligence Hub v2.2.1 / APP_VERSION 2.2.1</w:t>
+              <w:t>Fantasy Football Intelligence Hub v2.3.0 / APP_VERSION 2.3.0</w:t>
             </w:r>
           </w:p>
         </w:tc>
@@ -172,7 +172,7 @@
           </w:tcPr>
           <w:p>
             <w:r>
-              <w:t>Living design specification - Version 2.2.1 merged update</w:t>
+              <w:t>Living design specification — Version 2.3.0 release</w:t>
             </w:r>
           </w:p>
         </w:tc>
@@ -238,7 +238,7 @@
           </w:tcPr>
           <w:p>
             <w:r>
-              <w:t>July 29, 2026</w:t>
+              <w:t>August 1, 2026</w:t>
             </w:r>
           </w:p>
         </w:tc>
@@ -370,7 +370,7 @@
           </w:tcPr>
           <w:p>
             <w:r>
-              <w:t>Version-control decision: Version 2.2.1 remains the application baseline. The merged update reorganizes Dashboard and Team Insights content, adds league scoring history, and enforces the Week 17 fantasy championship cutoff without changing APP_VERSION.</w:t>
+              <w:t>Version-control decision: Version 2.3.0 is the application baseline. This release adds stateless Sleeper acquisition, on-demand linked-season evidence, Settings-based methodology and weighting, privacy safeguards, and the refined report navigation.</w:t>
             </w:r>
           </w:p>
         </w:tc>
@@ -432,13 +432,13 @@
         <w:pStyle w:val="Heading2"/>
       </w:pPr>
       <w:r>
-        <w:t>5.1 Version 2.1 League Analysis Experience</w:t>
+        <w:t>5.1 Version 2.3 League Analysis Experience</w:t>
       </w:r>
     </w:p>
     <w:p>
       <w:pPr/>
       <w:r>
-        <w:t>The landing page uses one primary Analyze League button. Live refresh, previous-report access, and report deletion are secondary actions. League format, roster structure, scoring, linked-season history, and future-pick horizon are detected automatically, while advanced overrides remain available for edge cases. Contender Ranking Weights include visible scope and calculation guidance. The loading workflow displays staged progress for a randomized minimum of 7 to 10 seconds unless real processing requires longer; errors interrupt immediately.</w:t>
+        <w:t>Analyze retrieves the current league data required for the Dashboard, then builds a metadata-only index of linked seasons. The landing page accepts a public Sleeper league ID and Contender Index weights; report persistence, report controls, and advanced detection overrides are removed. Deep transactions, drafts, matchups, and brackets load only when their related view is opened. Progress reflects real work without manufactured delay, and incomplete upstream results remain visible as warnings.</w:t>
       </w:r>
     </w:p>
     <w:p>
@@ -483,13 +483,13 @@
         <w:pStyle w:val="Heading2"/>
       </w:pPr>
       <w:r>
-        <w:t>5.4 Coming Soon! Placeholder</w:t>
+        <w:t>5.4 Player Trends Placeholder</w:t>
       </w:r>
     </w:p>
     <w:p>
       <w:pPr/>
       <w:r>
-        <w:t>The former Optimal Lineups page is intentionally empty under the Coming Soon! label. Existing optimal-lineup analysis remains on Team Insights alongside its full-roster evidence, avoiding duplicate reports while the next feature is developed.</w:t>
+        <w:t>Player Trends is intentionally empty while its future feature is under design. Existing optimal-lineup analysis remains on Team Insights alongside its full-roster evidence, avoiding duplicate reports.</w:t>
       </w:r>
     </w:p>
     <w:p>
@@ -497,12 +497,12 @@
         <w:pStyle w:val="Heading2"/>
       </w:pPr>
       <w:r>
-        <w:t>5.5 Version 2.2 Global Header</w:t>
+        <w:t>5.5 Version 2.3 Header and Navigation</w:t>
       </w:r>
     </w:p>
     <w:p>
       <w:r>
-        <w:t>The application uses one sticky responsive header instead of a separate branding header and report-tab banner. The logo is the product identifier. The application context area includes a grouped report-page selector, league name, detected settings summary, analysis update timestamp, Focus Team selector, data status, version badge, and an overflow menu for lower-frequency actions. On mobile, the header reduces to the compact logo, page selector, and overflow menu. Page changes update the URL hash, browser Back and Forward navigation, and local page preference while preserving the selected focus team.</w:t>
+        <w:t>The application uses one sticky responsive header with a larger product logo, release/data/version detail below the brand, Focus Team selection, and league context. Its eight tabs are Dashboard, Team Insights, Trade Center, Draft Capital, Player Trends, Player Tiers, Player Master, and Settings. Overflow menus, creator text, Sleeper identifiers, exports, and report-management controls are absent. Page changes update the URL hash and browser history while preserving the selected focus team.</w:t>
       </w:r>
     </w:p>
     <w:p>
@@ -565,12 +565,12 @@
     </w:p>
     <w:p>
       <w:r>
-        <w:t>Fantasy Football Intelligence Hub is a static, browser-based dynasty football analysis application published through GitHub Pages. Version 2.2.1 analyzes public Sleeper leagues, automatically detects league configuration and linked history, joins projection and dynasty-value sources, builds legal optimal lineups, ranks teams, evaluates risk and draft capital, and presents league-wide and focused-team reports.</w:t>
+        <w:t>Fantasy Football Intelligence Hub is a static, browser-based dynasty football analysis application published through GitHub Pages. Version 2.3.0 analyzes public Sleeper leagues, indexes linked seasons without persisting league data, joins projection and dynasty-value sources, builds legal optimal lineups, ranks teams, evaluates risk and draft capital, and presents league-wide and focused-team reports.</w:t>
       </w:r>
     </w:p>
     <w:p>
       <w:r>
-        <w:t>The merged Version 2.2.1 update makes the Dashboard league-centric and makes Team Insights the detailed selected-team report. It also adds linked-season League Scoring History, actionable Build and Shop candidates, full-roster evidence, and a strict Week 17 fantasy-season cutoff for matchup-derived performance data.</w:t>
+        <w:t>Version 2.3.0 adds stateless, on-demand Sleeper history acquisition with bounded concurrency, retries, timeouts, progress messages, session-only caching, and visible partial-failure handling. It moves Methodology into Settings, removes report persistence and exports, protects submitted identifiers, and preserves the strict Week 17 cutoff for fantasy-team performance data.</w:t>
       </w:r>
     </w:p>
     <w:tbl>
@@ -590,13 +590,7 @@
           </w:tcPr>
           <w:p>
             <w:r>
-              <w:rPr>
-                <w:b/>
-              </w:rPr>
-              <w:t xml:space="preserve">Current processing boundary: </w:t>
-            </w:r>
-            <w:r>
-              <w:t>League-specific analysis still executes in the user's browser. GitHub Actions preprocesses shared public source snapshots, while live APIs remain available as fallbacks when snapshots are empty, stale, or unavailable.</w:t>
+              <w:t>Current processing boundary: League-specific analysis executes in the user's browser. Linked-season metadata is indexed during Analyze; deeper history is requested only when its related page opens and remains only in session memory. GitHub Actions preprocesses shared public source snapshots, while live APIs remain available as fallbacks when snapshots are empty, stale, or unavailable.</w:t>
             </w:r>
           </w:p>
         </w:tc>
@@ -793,7 +787,7 @@
         <w:jc w:val="center"/>
       </w:pPr>
       <w:r>
-        <w:t>Figure 1. Fantasy Football Intelligence Hub Version 2.x published static architecture and data flow.</w:t>
+        <w:t>Figure 1. Fantasy Football Intelligence Hub Version 2.3.0 stateless client architecture and data flow.</w:t>
       </w:r>
     </w:p>
     <w:p>
@@ -1008,7 +1002,7 @@
           </w:tcPr>
           <w:p>
             <w:r>
-              <w:t>Register header events, page history, exports, sorting, startup, and global error listeners.</w:t>
+              <w:t>Register header events, page history, sorting, session cleanup, startup, and global error listeners.</w:t>
             </w:r>
           </w:p>
         </w:tc>
@@ -1055,7 +1049,7 @@
           </w:tcPr>
           <w:p>
             <w:r>
-              <w:t>Coordinate data processing, linked-season weekly history, and page rendering.</w:t>
+              <w:t>Coordinate current data processing, deferred linked-season evidence, and page rendering.</w:t>
             </w:r>
           </w:p>
         </w:tc>
@@ -1241,10 +1235,7 @@
               <w:spacing w:after="0"/>
             </w:pPr>
             <w:r>
-              <w:rPr>
-                <w:sz w:val="15"/>
-              </w:rPr>
-              <w:t>IndexedDB + data/*.json</w:t>
+              <w:t>Session memory + data/*.json</w:t>
             </w:r>
           </w:p>
         </w:tc>
@@ -1258,10 +1249,7 @@
               <w:spacing w:after="0"/>
             </w:pPr>
             <w:r>
-              <w:rPr>
-                <w:sz w:val="15"/>
-              </w:rPr>
-              <w:t>Store user-local analyses and repository-managed shared snapshots.</w:t>
+              <w:t>Keep league evidence transient; retain IndexedDB only for the daily public player cache and repository-managed snapshots.</w:t>
             </w:r>
           </w:p>
         </w:tc>
@@ -1350,7 +1338,7 @@
         <w:pStyle w:val="ListNumber"/>
       </w:pPr>
       <w:r>
-        <w:t>The user enters a public Sleeper league ID, optionally expands advanced overrides, and starts analysis through one primary Analyze League action.</w:t>
+        <w:t>The user enters a public Sleeper league ID, optionally adjusts Contender Index weights, and starts analysis through one primary Analyze League action.</w:t>
       </w:r>
     </w:p>
     <w:p>
@@ -1358,7 +1346,7 @@
         <w:pStyle w:val="ListNumber"/>
       </w:pPr>
       <w:r>
-        <w:t>analyze.js retrieves league-specific Sleeper data and shared provider data, detects league setup and linked history, and creates team summaries plus chart-ready weekly scoring histories.</w:t>
+        <w:t>analyze.js retrieves current Sleeper and shared provider data, detects league setup, builds a metadata-only linked-season index, and creates the initial Dashboard-ready report.</w:t>
       </w:r>
     </w:p>
     <w:p>
@@ -1390,7 +1378,7 @@
         <w:pStyle w:val="ListNumber"/>
       </w:pPr>
       <w:r>
-        <w:t>Completed analysis is cached in IndexedDB and can be exported as JSON, CSV, embedded HTML, or print/PDF. The shared header synchronizes report-page selection with browser history and local view preference.</w:t>
+        <w:t>Deferred league evidence is cached only in module-scoped session memory and is cleared on reload, tab close, or Change League. The shared header synchronizes report-page selection with browser history while preserving the selected focus team.</w:t>
       </w:r>
     </w:p>
     <w:p>
@@ -11345,6 +11333,90 @@
           </w:p>
         </w:tc>
       </w:tr>
+      <w:tr>
+        <w:tc>
+          <w:tcPr>
+            <w:tcW w:type="dxa" w:w="2556"/>
+          </w:tcPr>
+          <w:p>
+            <w:r>
+              <w:t>August 1, 2026</w:t>
+            </w:r>
+          </w:p>
+        </w:tc>
+        <w:tc>
+          <w:tcPr>
+            <w:tcW w:type="dxa" w:w="2556"/>
+          </w:tcPr>
+          <w:p>
+            <w:r>
+              <w:t>2.3.0</w:t>
+            </w:r>
+          </w:p>
+        </w:tc>
+        <w:tc>
+          <w:tcPr>
+            <w:tcW w:type="dxa" w:w="2556"/>
+          </w:tcPr>
+          <w:p>
+            <w:r>
+              <w:t>v2.3.0 / 2.3.0</w:t>
+            </w:r>
+          </w:p>
+        </w:tc>
+        <w:tc>
+          <w:tcPr>
+            <w:tcW w:type="dxa" w:w="2556"/>
+          </w:tcPr>
+          <w:p>
+            <w:r>
+              <w:t>Released stateless Sleeper acquisition with session-only deep-history loading, retries and partial-failure visibility; moved Methodology into Settings; removed report persistence and exports; refreshed header and navigation labels; and documented Week 18 exclusion and identifier privacy.</w:t>
+            </w:r>
+          </w:p>
+        </w:tc>
+      </w:tr>
+      <w:tr>
+        <w:tc>
+          <w:tcPr>
+            <w:tcW w:type="dxa" w:w="2556"/>
+          </w:tcPr>
+          <w:p>
+            <w:r>
+              <w:t>August 1, 2026</w:t>
+            </w:r>
+          </w:p>
+        </w:tc>
+        <w:tc>
+          <w:tcPr>
+            <w:tcW w:type="dxa" w:w="2556"/>
+          </w:tcPr>
+          <w:p>
+            <w:r>
+              <w:t>2.3.0</w:t>
+            </w:r>
+          </w:p>
+        </w:tc>
+        <w:tc>
+          <w:tcPr>
+            <w:tcW w:type="dxa" w:w="2556"/>
+          </w:tcPr>
+          <w:p>
+            <w:r>
+              <w:t>v2.3.0 / 2.3.0</w:t>
+            </w:r>
+          </w:p>
+        </w:tc>
+        <w:tc>
+          <w:tcPr>
+            <w:tcW w:type="dxa" w:w="2556"/>
+          </w:tcPr>
+          <w:p>
+            <w:r>
+              <w:t>Released stateless Sleeper acquisition with session-only deep-history loading, retries and partial-failure visibility; moved Methodology into Settings; removed report persistence and exports; refreshed header and navigation labels; and documented Week 18 exclusion and identifier privacy.</w:t>
+            </w:r>
+          </w:p>
+        </w:tc>
+      </w:tr>
     </w:tbl>
     <w:p/>
     <w:p>
@@ -11408,7 +11480,7 @@
         <w:pStyle w:val="ListBullet"/>
       </w:pPr>
       <w:r>
-        <w:t>Test all application tabs and exports through the local HTTP server.</w:t>
+        <w:t>Test all application tabs through the local HTTP server, including desktop and narrow layouts.</w:t>
       </w:r>
     </w:p>
     <w:p>
@@ -11525,7 +11597,7 @@
         <w:pStyle w:val="ListBullet"/>
       </w:pPr>
       <w:r>
-        <w:t>New analyses persist starterCount and starterSlots alongside rosterSlots so saved reports retain explicit lineup metadata.</w:t>
+        <w:t>New analyses retain starterCount and starterSlots alongside rosterSlots in the in-memory report for the current browser session.</w:t>
       </w:r>
     </w:p>
     <w:p>
@@ -11565,6 +11637,75 @@
         <w:t>starterCount resolution order: explicit analysis starterCount; detectedSetup.starterCount; starterSlots; rosterSlots; direct or nested Sleeper roster_positions. The derived output is a positive integer or null.</w:t>
       </w:r>
     </w:p>
+    <w:p>
+      <w:pPr>
+        <w:pStyle w:val="Heading1"/>
+      </w:pPr>
+      <w:r>
+        <w:t>Version 2.3.0 — Stateless Sleeper Acquisition</w:t>
+      </w:r>
+    </w:p>
+    <w:p>
+      <w:r>
+        <w:t>Version 2.3.0 makes linked Sleeper league history available without a persistent league database. Analyze loads live current-season data and a linked-season index first, then page-level resources load on demand and are kept only in browser memory for the current tab.</w:t>
+      </w:r>
+    </w:p>
+    <w:p>
+      <w:pPr>
+        <w:pStyle w:val="ListBullet"/>
+      </w:pPr>
+      <w:r>
+        <w:t>Settings now contains Contender Index weights, Methodology, and collapsed League History Evidence.</w:t>
+      </w:r>
+    </w:p>
+    <w:p>
+      <w:pPr>
+        <w:pStyle w:val="ListBullet"/>
+      </w:pPr>
+      <w:r>
+        <w:t>Team Insights requests linked-season roster and Week 1–17 matchup history only when opened.</w:t>
+      </w:r>
+    </w:p>
+    <w:p>
+      <w:pPr>
+        <w:pStyle w:val="ListBullet"/>
+      </w:pPr>
+      <w:r>
+        <w:t>Deep evidence requests use bounded concurrency, retry and timeout behavior, progress updates, and visible partial-data warnings.</w:t>
+      </w:r>
+    </w:p>
+    <w:p>
+      <w:pPr>
+        <w:pStyle w:val="ListBullet"/>
+      </w:pPr>
+      <w:r>
+        <w:t>League IDs and Sleeper user identifiers are excluded from report payloads, URLs, header text, and application error messages.</w:t>
+      </w:r>
+    </w:p>
+    <w:p>
+      <w:pPr>
+        <w:pStyle w:val="ListBullet"/>
+      </w:pPr>
+      <w:r>
+        <w:t>NFL Week 18 is excluded from fantasy-team performance metrics and charts.</w:t>
+      </w:r>
+    </w:p>
+    <w:p>
+      <w:pPr>
+        <w:pStyle w:val="ListBullet"/>
+      </w:pPr>
+      <w:r>
+        <w:t>Report persistence, exports, printing, advanced detection overrides, and header overflow controls are removed.</w:t>
+      </w:r>
+    </w:p>
+    <w:p>
+      <w:pPr>
+        <w:pStyle w:val="ListBullet"/>
+      </w:pPr>
+      <w:r>
+        <w:t>Report tabs are Dashboard, Team Insights, Trade Center, Draft Capital, Player Trends, Player Tiers, Player Master, and Settings.</w:t>
+      </w:r>
+    </w:p>
     <w:sectPr>
       <w:footerReference w:type="default" r:id="rId10"/>
       <w:headerReference w:type="default" r:id="rId11"/>
@@ -11585,7 +11726,7 @@
       <w:jc w:val="center"/>
     </w:pPr>
     <w:r>
-      <w:t>Fantasy Football Intelligence Hub | Software Design Specification | Version 2.2.1</w:t>
+      <w:t>Fantasy Football Intelligence Hub | Software Design Specification | Version 2.3.0</w:t>
     </w:r>
   </w:p>
 </w:ftr>

</xml_diff>